<commit_message>
ajustes templates & bump version
</commit_message>
<xml_diff>
--- a/inst/rmarkdown/templates/word_doc/resources/midr-template-georgia.docx
+++ b/inst/rmarkdown/templates/word_doc/resources/midr-template-georgia.docx
@@ -504,7 +504,7 @@
     </w:pPr>
     <w:r>
       <w:drawing>
-        <wp:anchor behindDoc="1" distT="0" distB="0" distL="0" distR="0" simplePos="0" locked="0" layoutInCell="0" allowOverlap="1" relativeHeight="3">
+        <wp:anchor behindDoc="1" distT="0" distB="0" distL="0" distR="0" simplePos="0" locked="0" layoutInCell="0" allowOverlap="1" relativeHeight="8">
           <wp:simplePos x="0" y="0"/>
           <wp:positionH relativeFrom="margin">
             <wp:posOffset>-903605</wp:posOffset>
@@ -542,6 +542,7 @@
                   <a:prstGeom prst="rect">
                     <a:avLst/>
                   </a:prstGeom>
+                  <a:noFill/>
                 </pic:spPr>
               </pic:pic>
             </a:graphicData>
@@ -635,6 +636,7 @@
                         <a:prstGeom prst="rect">
                           <a:avLst/>
                         </a:prstGeom>
+                        <a:noFill/>
                       </pic:spPr>
                     </pic:pic>
                   </a:graphicData>
@@ -863,6 +865,7 @@
                         <a:prstGeom prst="rect">
                           <a:avLst/>
                         </a:prstGeom>
+                        <a:noFill/>
                       </pic:spPr>
                     </pic:pic>
                   </a:graphicData>
@@ -925,7 +928,7 @@
     </w:pPr>
     <w:r>
       <w:drawing>
-        <wp:anchor behindDoc="1" distT="0" distB="0" distL="0" distR="0" simplePos="0" locked="0" layoutInCell="0" allowOverlap="1" relativeHeight="6">
+        <wp:anchor behindDoc="1" distT="0" distB="0" distL="0" distR="0" simplePos="0" locked="0" layoutInCell="0" allowOverlap="1" relativeHeight="11">
           <wp:simplePos x="0" y="0"/>
           <wp:positionH relativeFrom="margin">
             <wp:posOffset>-906145</wp:posOffset>
@@ -963,6 +966,7 @@
                   <a:prstGeom prst="rect">
                     <a:avLst/>
                   </a:prstGeom>
+                  <a:noFill/>
                 </pic:spPr>
               </pic:pic>
             </a:graphicData>
@@ -1062,6 +1066,7 @@
                         <a:prstGeom prst="rect">
                           <a:avLst/>
                         </a:prstGeom>
+                        <a:noFill/>
                       </pic:spPr>
                     </pic:pic>
                   </a:graphicData>
@@ -1290,6 +1295,7 @@
                         <a:prstGeom prst="rect">
                           <a:avLst/>
                         </a:prstGeom>
+                        <a:noFill/>
                       </pic:spPr>
                     </pic:pic>
                   </a:graphicData>
@@ -1387,6 +1393,7 @@
                   <a:prstGeom prst="rect">
                     <a:avLst/>
                   </a:prstGeom>
+                  <a:noFill/>
                 </pic:spPr>
               </pic:pic>
             </a:graphicData>
@@ -3319,7 +3326,7 @@
     </w:rPr>
   </w:style>
   <w:style w:type="paragraph" w:styleId="Heading1">
-    <w:name w:val="Heading 1"/>
+    <w:name w:val="heading 1"/>
     <w:basedOn w:val="Normal"/>
     <w:next w:val="Normal"/>
     <w:uiPriority w:val="7"/>
@@ -3340,7 +3347,7 @@
     </w:rPr>
   </w:style>
   <w:style w:type="paragraph" w:styleId="Heading2">
-    <w:name w:val="Heading 2"/>
+    <w:name w:val="heading 2"/>
     <w:basedOn w:val="Normal"/>
     <w:next w:val="Normal"/>
     <w:uiPriority w:val="8"/>
@@ -3361,7 +3368,7 @@
     </w:rPr>
   </w:style>
   <w:style w:type="paragraph" w:styleId="Heading3">
-    <w:name w:val="Heading 3"/>
+    <w:name w:val="heading 3"/>
     <w:basedOn w:val="Normal"/>
     <w:next w:val="Normal"/>
     <w:uiPriority w:val="9"/>
@@ -3382,7 +3389,7 @@
     </w:rPr>
   </w:style>
   <w:style w:type="paragraph" w:styleId="Heading4">
-    <w:name w:val="Heading 4"/>
+    <w:name w:val="heading 4"/>
     <w:basedOn w:val="Normal"/>
     <w:next w:val="Normal"/>
     <w:uiPriority w:val="9"/>
@@ -3403,7 +3410,7 @@
     </w:rPr>
   </w:style>
   <w:style w:type="paragraph" w:styleId="Heading5">
-    <w:name w:val="Heading 5"/>
+    <w:name w:val="heading 5"/>
     <w:basedOn w:val="Normal"/>
     <w:next w:val="Normal"/>
     <w:uiPriority w:val="9"/>
@@ -3423,7 +3430,7 @@
     </w:rPr>
   </w:style>
   <w:style w:type="paragraph" w:styleId="Heading6">
-    <w:name w:val="Heading 6"/>
+    <w:name w:val="heading 6"/>
     <w:basedOn w:val="Normal"/>
     <w:next w:val="Normal"/>
     <w:uiPriority w:val="9"/>
@@ -3442,7 +3449,7 @@
     </w:rPr>
   </w:style>
   <w:style w:type="paragraph" w:styleId="Heading7">
-    <w:name w:val="Heading 7"/>
+    <w:name w:val="heading 7"/>
     <w:basedOn w:val="Normal"/>
     <w:next w:val="Normal"/>
     <w:uiPriority w:val="9"/>
@@ -3463,7 +3470,7 @@
     </w:rPr>
   </w:style>
   <w:style w:type="paragraph" w:styleId="Heading8">
-    <w:name w:val="Heading 8"/>
+    <w:name w:val="heading 8"/>
     <w:basedOn w:val="Normal"/>
     <w:next w:val="Normal"/>
     <w:uiPriority w:val="9"/>
@@ -3484,7 +3491,7 @@
     </w:rPr>
   </w:style>
   <w:style w:type="paragraph" w:styleId="Heading9">
-    <w:name w:val="Heading 9"/>
+    <w:name w:val="heading 9"/>
     <w:basedOn w:val="Normal"/>
     <w:next w:val="Normal"/>
     <w:uiPriority w:val="9"/>
@@ -3514,7 +3521,7 @@
     <w:qFormat/>
     <w:rPr/>
   </w:style>
-  <w:style w:type="character" w:styleId="annotationreference">
+  <w:style w:type="character" w:styleId="CommentReference">
     <w:name w:val="annotation reference"/>
     <w:basedOn w:val="DefaultParagraphFont"/>
     <w:uiPriority w:val="99"/>
@@ -3539,8 +3546,16 @@
       <w:iCs/>
     </w:rPr>
   </w:style>
+  <w:style w:type="character" w:styleId="Caracteresdenotadefim" w:customStyle="1">
+    <w:name w:val="Caracteres de nota de fim"/>
+    <w:uiPriority w:val="0"/>
+    <w:qFormat/>
+    <w:rPr>
+      <w:vertAlign w:val="superscript"/>
+    </w:rPr>
+  </w:style>
   <w:style w:type="character" w:styleId="EndnoteReference">
-    <w:name w:val="Endnote Reference"/>
+    <w:name w:val="endnote reference"/>
     <w:rPr>
       <w:vertAlign w:val="superscript"/>
     </w:rPr>
@@ -3587,8 +3602,16 @@
       <w:u w:val="single"/>
     </w:rPr>
   </w:style>
+  <w:style w:type="character" w:styleId="Caracteresdenotaderodap" w:customStyle="1">
+    <w:name w:val="Caracteres de nota de rodapé"/>
+    <w:uiPriority w:val="0"/>
+    <w:qFormat/>
+    <w:rPr>
+      <w:vertAlign w:val="superscript"/>
+    </w:rPr>
+  </w:style>
   <w:style w:type="character" w:styleId="FootnoteReference">
-    <w:name w:val="Footnote Reference"/>
+    <w:name w:val="footnote reference"/>
     <w:rPr>
       <w:vertAlign w:val="superscript"/>
     </w:rPr>
@@ -4000,7 +4023,7 @@
   <w:style w:type="character" w:styleId="TextodemacroChar" w:customStyle="1">
     <w:name w:val="Texto de macro Char"/>
     <w:basedOn w:val="DefaultParagraphFont"/>
-    <w:link w:val="macro"/>
+    <w:link w:val="MacroText"/>
     <w:uiPriority w:val="99"/>
     <w:semiHidden/>
     <w:qFormat/>
@@ -4605,18 +4628,6 @@
       <w:vertAlign w:val="superscript"/>
     </w:rPr>
   </w:style>
-  <w:style w:type="character" w:styleId="Caracteresdenotaderodap" w:customStyle="1">
-    <w:name w:val="Caracteres de nota de rodapé"/>
-    <w:uiPriority w:val="0"/>
-    <w:qFormat/>
-    <w:rPr/>
-  </w:style>
-  <w:style w:type="character" w:styleId="Caracteresdenotadefim" w:customStyle="1">
-    <w:name w:val="Caracteres de nota de fim"/>
-    <w:uiPriority w:val="0"/>
-    <w:qFormat/>
-    <w:rPr/>
-  </w:style>
   <w:style w:type="paragraph" w:styleId="Ttulo" w:customStyle="1">
     <w:name w:val="Título"/>
     <w:basedOn w:val="Normal"/>
@@ -4659,7 +4670,7 @@
     <w:rPr/>
   </w:style>
   <w:style w:type="paragraph" w:styleId="Caption">
-    <w:name w:val="Caption"/>
+    <w:name w:val="caption"/>
     <w:basedOn w:val="Normal"/>
     <w:next w:val="Normal"/>
     <w:uiPriority w:val="35"/>
@@ -4713,7 +4724,6 @@
     <w:unhideWhenUsed/>
     <w:qFormat/>
     <w:pPr>
-      <w:pBdr/>
       <w:spacing w:lineRule="auto" w:line="276"/>
       <w:ind w:left="2285" w:right="584"/>
     </w:pPr>
@@ -4821,8 +4831,8 @@
     </w:pPr>
     <w:rPr/>
   </w:style>
-  <w:style w:type="paragraph" w:styleId="AnnotationText">
-    <w:name w:val="Annotation Text"/>
+  <w:style w:type="paragraph" w:styleId="CommentText">
+    <w:name w:val="annotation text"/>
     <w:basedOn w:val="Normal"/>
     <w:link w:val="TextodecomentrioChar"/>
     <w:uiPriority w:val="99"/>
@@ -4838,8 +4848,8 @@
   </w:style>
   <w:style w:type="paragraph" w:styleId="annotationsubject">
     <w:name w:val="annotation subject"/>
-    <w:basedOn w:val="AnnotationText"/>
-    <w:next w:val="AnnotationText"/>
+    <w:basedOn w:val="CommentText"/>
+    <w:next w:val="CommentText"/>
     <w:link w:val="AssuntodocomentrioChar"/>
     <w:uiPriority w:val="99"/>
     <w:semiHidden/>
@@ -4900,7 +4910,7 @@
     <w:rPr/>
   </w:style>
   <w:style w:type="paragraph" w:styleId="EndnoteText">
-    <w:name w:val="Endnote Text"/>
+    <w:name w:val="endnote text"/>
     <w:basedOn w:val="Normal"/>
     <w:link w:val="TextodenotadefimChar"/>
     <w:uiPriority w:val="99"/>
@@ -4915,7 +4925,7 @@
     </w:rPr>
   </w:style>
   <w:style w:type="paragraph" w:styleId="EnvelopeAddress">
-    <w:name w:val="Envelope Address"/>
+    <w:name w:val="envelope address"/>
     <w:basedOn w:val="Normal"/>
     <w:uiPriority w:val="99"/>
     <w:semiHidden/>
@@ -4932,7 +4942,7 @@
     </w:rPr>
   </w:style>
   <w:style w:type="paragraph" w:styleId="EnvelopeReturn">
-    <w:name w:val="Envelope Return"/>
+    <w:name w:val="envelope return"/>
     <w:basedOn w:val="Normal"/>
     <w:uiPriority w:val="99"/>
     <w:semiHidden/>
@@ -4955,7 +4965,7 @@
     <w:rPr/>
   </w:style>
   <w:style w:type="paragraph" w:styleId="Footer">
-    <w:name w:val="Footer"/>
+    <w:name w:val="footer"/>
     <w:basedOn w:val="Normal"/>
     <w:link w:val="RodapChar"/>
     <w:uiPriority w:val="30"/>
@@ -4974,7 +4984,7 @@
     </w:rPr>
   </w:style>
   <w:style w:type="paragraph" w:styleId="FootnoteText">
-    <w:name w:val="Footnote Text"/>
+    <w:name w:val="footnote text"/>
     <w:basedOn w:val="Normal"/>
     <w:link w:val="TextodenotaderodapChar"/>
     <w:uiPriority w:val="99"/>
@@ -4990,7 +5000,7 @@
     </w:rPr>
   </w:style>
   <w:style w:type="paragraph" w:styleId="Header">
-    <w:name w:val="Header"/>
+    <w:name w:val="header"/>
     <w:basedOn w:val="Normal"/>
     <w:link w:val="CabealhoChar"/>
     <w:uiPriority w:val="99"/>
@@ -5040,7 +5050,7 @@
     </w:rPr>
   </w:style>
   <w:style w:type="paragraph" w:styleId="Index1">
-    <w:name w:val="Index 1"/>
+    <w:name w:val="index 1"/>
     <w:basedOn w:val="Normal"/>
     <w:next w:val="Normal"/>
     <w:uiPriority w:val="99"/>
@@ -5054,7 +5064,7 @@
     <w:rPr/>
   </w:style>
   <w:style w:type="paragraph" w:styleId="Index2">
-    <w:name w:val="Index 2"/>
+    <w:name w:val="index 2"/>
     <w:basedOn w:val="Normal"/>
     <w:next w:val="Normal"/>
     <w:uiPriority w:val="99"/>
@@ -5068,7 +5078,7 @@
     <w:rPr/>
   </w:style>
   <w:style w:type="paragraph" w:styleId="Index3">
-    <w:name w:val="Index 3"/>
+    <w:name w:val="index 3"/>
     <w:basedOn w:val="Normal"/>
     <w:next w:val="Normal"/>
     <w:uiPriority w:val="99"/>
@@ -5081,7 +5091,7 @@
     </w:pPr>
     <w:rPr/>
   </w:style>
-  <w:style w:type="paragraph" w:styleId="index4">
+  <w:style w:type="paragraph" w:styleId="Index4">
     <w:name w:val="index 4"/>
     <w:basedOn w:val="Normal"/>
     <w:next w:val="Normal"/>
@@ -5095,7 +5105,7 @@
     </w:pPr>
     <w:rPr/>
   </w:style>
-  <w:style w:type="paragraph" w:styleId="index5">
+  <w:style w:type="paragraph" w:styleId="Index5">
     <w:name w:val="index 5"/>
     <w:basedOn w:val="Normal"/>
     <w:next w:val="Normal"/>
@@ -5109,7 +5119,7 @@
     </w:pPr>
     <w:rPr/>
   </w:style>
-  <w:style w:type="paragraph" w:styleId="index6">
+  <w:style w:type="paragraph" w:styleId="Index6">
     <w:name w:val="index 6"/>
     <w:basedOn w:val="Normal"/>
     <w:next w:val="Normal"/>
@@ -5123,7 +5133,7 @@
     </w:pPr>
     <w:rPr/>
   </w:style>
-  <w:style w:type="paragraph" w:styleId="index7">
+  <w:style w:type="paragraph" w:styleId="Index7">
     <w:name w:val="index 7"/>
     <w:basedOn w:val="Normal"/>
     <w:next w:val="Normal"/>
@@ -5137,7 +5147,7 @@
     </w:pPr>
     <w:rPr/>
   </w:style>
-  <w:style w:type="paragraph" w:styleId="index8">
+  <w:style w:type="paragraph" w:styleId="Index8">
     <w:name w:val="index 8"/>
     <w:basedOn w:val="Normal"/>
     <w:next w:val="Normal"/>
@@ -5151,7 +5161,7 @@
     </w:pPr>
     <w:rPr/>
   </w:style>
-  <w:style w:type="paragraph" w:styleId="index9">
+  <w:style w:type="paragraph" w:styleId="Index9">
     <w:name w:val="index 9"/>
     <w:basedOn w:val="Normal"/>
     <w:next w:val="Normal"/>
@@ -5166,7 +5176,7 @@
     <w:rPr/>
   </w:style>
   <w:style w:type="paragraph" w:styleId="IndexHeading">
-    <w:name w:val="Index Heading"/>
+    <w:name w:val="index heading"/>
     <w:basedOn w:val="Normal"/>
     <w:next w:val="Index1"/>
     <w:uiPriority w:val="99"/>
@@ -5475,7 +5485,7 @@
     </w:pPr>
     <w:rPr/>
   </w:style>
-  <w:style w:type="paragraph" w:styleId="macro">
+  <w:style w:type="paragraph" w:styleId="MacroText">
     <w:name w:val="macro"/>
     <w:link w:val="TextodemacroChar"/>
     <w:uiPriority w:val="99"/>
@@ -5627,7 +5637,7 @@
     </w:rPr>
   </w:style>
   <w:style w:type="paragraph" w:styleId="TableofAuthorities">
-    <w:name w:val="Table of Authorities"/>
+    <w:name w:val="table of authorities"/>
     <w:basedOn w:val="Normal"/>
     <w:next w:val="Normal"/>
     <w:uiPriority w:val="99"/>
@@ -5641,7 +5651,7 @@
     <w:rPr/>
   </w:style>
   <w:style w:type="paragraph" w:styleId="TableofFigures">
-    <w:name w:val="Table of Figures"/>
+    <w:name w:val="table of figures"/>
     <w:basedOn w:val="Normal"/>
     <w:next w:val="Normal"/>
     <w:uiPriority w:val="99"/>
@@ -5698,7 +5708,7 @@
     </w:rPr>
   </w:style>
   <w:style w:type="paragraph" w:styleId="TOC1">
-    <w:name w:val="TOC 1"/>
+    <w:name w:val="toc 1"/>
     <w:basedOn w:val="Normal"/>
     <w:next w:val="Normal"/>
     <w:uiPriority w:val="39"/>
@@ -5715,7 +5725,7 @@
     </w:rPr>
   </w:style>
   <w:style w:type="paragraph" w:styleId="TOC2">
-    <w:name w:val="TOC 2"/>
+    <w:name w:val="toc 2"/>
     <w:basedOn w:val="Normal"/>
     <w:next w:val="Normal"/>
     <w:uiPriority w:val="39"/>
@@ -5731,7 +5741,7 @@
     </w:rPr>
   </w:style>
   <w:style w:type="paragraph" w:styleId="TOC3">
-    <w:name w:val="TOC 3"/>
+    <w:name w:val="toc 3"/>
     <w:basedOn w:val="Normal"/>
     <w:next w:val="Normal"/>
     <w:uiPriority w:val="39"/>
@@ -5745,7 +5755,7 @@
     </w:rPr>
   </w:style>
   <w:style w:type="paragraph" w:styleId="TOC4">
-    <w:name w:val="TOC 4"/>
+    <w:name w:val="toc 4"/>
     <w:basedOn w:val="Normal"/>
     <w:next w:val="Normal"/>
     <w:uiPriority w:val="39"/>
@@ -5757,7 +5767,7 @@
     <w:rPr/>
   </w:style>
   <w:style w:type="paragraph" w:styleId="TOC5">
-    <w:name w:val="TOC 5"/>
+    <w:name w:val="toc 5"/>
     <w:basedOn w:val="Normal"/>
     <w:next w:val="Normal"/>
     <w:uiPriority w:val="39"/>
@@ -5769,7 +5779,7 @@
     <w:rPr/>
   </w:style>
   <w:style w:type="paragraph" w:styleId="TOC6">
-    <w:name w:val="TOC 6"/>
+    <w:name w:val="toc 6"/>
     <w:basedOn w:val="Normal"/>
     <w:next w:val="Normal"/>
     <w:uiPriority w:val="39"/>
@@ -5781,7 +5791,7 @@
     <w:rPr/>
   </w:style>
   <w:style w:type="paragraph" w:styleId="TOC7">
-    <w:name w:val="TOC 7"/>
+    <w:name w:val="toc 7"/>
     <w:basedOn w:val="Normal"/>
     <w:next w:val="Normal"/>
     <w:uiPriority w:val="39"/>
@@ -5793,7 +5803,7 @@
     <w:rPr/>
   </w:style>
   <w:style w:type="paragraph" w:styleId="TOC8">
-    <w:name w:val="TOC 8"/>
+    <w:name w:val="toc 8"/>
     <w:basedOn w:val="Normal"/>
     <w:next w:val="Normal"/>
     <w:uiPriority w:val="39"/>
@@ -5805,7 +5815,7 @@
     <w:rPr/>
   </w:style>
   <w:style w:type="paragraph" w:styleId="TOC9">
-    <w:name w:val="TOC 9"/>
+    <w:name w:val="toc 9"/>
     <w:basedOn w:val="Normal"/>
     <w:next w:val="Normal"/>
     <w:uiPriority w:val="39"/>
@@ -6114,6 +6124,7 @@
     <w:qFormat/>
     <w:pPr>
       <w:shd w:val="clear" w:color="auto" w:fill="F8F8F8"/>
+      <w:jc w:val="left"/>
     </w:pPr>
     <w:rPr>
       <w:rFonts w:ascii="Consolas" w:hAnsi="Consolas"/>
@@ -6164,7 +6175,7 @@
       <w:i w:val="false"/>
       <w:color w:themeColor="text2" w:val="000000"/>
       <w:sz w:val="20"/>
-      <w:lang w:val="en-US"/>
+      <w:lang w:val="pt-BR"/>
     </w:rPr>
   </w:style>
   <w:style w:type="paragraph" w:styleId="Compact" w:customStyle="1">

</xml_diff>